<commit_message>
Updated final report and readme file
</commit_message>
<xml_diff>
--- a/Capstone_Final_Report.docx
+++ b/Capstone_Final_Report.docx
@@ -226,15 +226,8 @@
                 <w:rFonts w:ascii="Cambria" w:hAnsi="Cambria" w:cs="Noto"/>
                 <w:shd w:val="clear" w:color="auto" w:fill="FFFFFF"/>
               </w:rPr>
-              <w:t xml:space="preserve">The type of learning is classification. The expected output of the selected model is the prediction of customers who are likely to churn and the features that drive </w:t>
-            </w:r>
-            <w:r>
-              <w:rPr>
-                <w:rFonts w:ascii="Cambria" w:hAnsi="Cambria" w:cs="Noto"/>
-                <w:shd w:val="clear" w:color="auto" w:fill="FFFFFF"/>
-              </w:rPr>
               <w:lastRenderedPageBreak/>
-              <w:t xml:space="preserve">churn. Supervised machine learning algorithms are used to build predictive models. </w:t>
+              <w:t xml:space="preserve">The type of learning is classification. The expected output of the selected model is the prediction of customers who are likely to churn and the features that drive churn. Supervised machine learning algorithms are used to build predictive models. </w:t>
             </w:r>
           </w:p>
           <w:p>
@@ -565,6 +558,7 @@
                 <w:rFonts w:ascii="Cambria" w:hAnsi="Cambria" w:cs="Noto"/>
                 <w:shd w:val="clear" w:color="auto" w:fill="FFFFFF"/>
               </w:rPr>
+              <w:lastRenderedPageBreak/>
               <w:t xml:space="preserve">The column with missing values is identified: </w:t>
             </w:r>
             <w:r>
@@ -618,7 +612,6 @@
                 <w:rFonts w:ascii="Cambria" w:hAnsi="Cambria" w:cs="Noto"/>
                 <w:shd w:val="clear" w:color="auto" w:fill="FFFFFF"/>
               </w:rPr>
-              <w:lastRenderedPageBreak/>
               <w:t xml:space="preserve">The percentage of missing values is not high enough to warrant dropping the column. The missing values are instead replaced with the column mode: </w:t>
             </w:r>
           </w:p>
@@ -1049,6 +1042,7 @@
                 <w:rFonts w:ascii="Cambria" w:hAnsi="Cambria" w:cs="Courier New"/>
                 <w:bCs/>
               </w:rPr>
+              <w:lastRenderedPageBreak/>
               <w:t>For the box plots, p</w:t>
             </w:r>
             <w:r>
@@ -1146,7 +1140,6 @@
                 <w:rFonts w:ascii="Cambria" w:hAnsi="Cambria" w:cs="Courier New"/>
                 <w:bCs/>
               </w:rPr>
-              <w:lastRenderedPageBreak/>
               <w:t>Stacked bars of categorical features (in percentages) are plotted.</w:t>
             </w:r>
             <w:r>
@@ -1801,6 +1794,7 @@
                 <w:sz w:val="21"/>
                 <w:szCs w:val="21"/>
               </w:rPr>
+              <w:lastRenderedPageBreak/>
               <w:t xml:space="preserve">StandardScaler </w:t>
             </w:r>
             <w:r>
@@ -1997,16 +1991,7 @@
                 <w:sz w:val="21"/>
                 <w:szCs w:val="21"/>
               </w:rPr>
-              <w:t xml:space="preserve">KNeighborsClassifier, </w:t>
-            </w:r>
-            <w:r>
-              <w:rPr>
-                <w:rFonts w:ascii="Courier New" w:hAnsi="Courier New" w:cs="Courier New"/>
-                <w:sz w:val="21"/>
-                <w:szCs w:val="21"/>
-              </w:rPr>
-              <w:lastRenderedPageBreak/>
-              <w:t xml:space="preserve">SVC (Support Vector </w:t>
+              <w:t xml:space="preserve">KNeighborsClassifier, SVC (Support Vector </w:t>
             </w:r>
             <w:r>
               <w:rPr>
@@ -2638,6 +2623,7 @@
               <w:rPr>
                 <w:rFonts w:ascii="Cambria" w:hAnsi="Cambria" w:cs="Courier New"/>
               </w:rPr>
+              <w:lastRenderedPageBreak/>
               <w:t xml:space="preserve">The </w:t>
             </w:r>
             <w:r>
@@ -2962,274 +2948,273 @@
                 <w:rFonts w:ascii="Cambria" w:hAnsi="Cambria" w:cs="Noto"/>
                 <w:shd w:val="clear" w:color="auto" w:fill="FFFFFF"/>
               </w:rPr>
-              <w:t xml:space="preserve"> - predicted </w:t>
-            </w:r>
-            <w:r>
-              <w:rPr>
-                <w:rFonts w:ascii="Cambria" w:hAnsi="Cambria" w:cs="Noto"/>
+              <w:t xml:space="preserve"> - predicted to churn but stayed, cost of retention offer) and </w:t>
+            </w:r>
+            <w:r>
+              <w:rPr>
+                <w:rFonts w:ascii="Courier New" w:hAnsi="Courier New" w:cs="Courier New"/>
+                <w:sz w:val="21"/>
+                <w:szCs w:val="21"/>
+                <w:shd w:val="clear" w:color="auto" w:fill="FFFFFF"/>
+              </w:rPr>
+              <w:t>true positives</w:t>
+            </w:r>
+            <w:r>
+              <w:rPr>
+                <w:rFonts w:ascii="Cambria" w:hAnsi="Cambria" w:cs="Noto"/>
+                <w:shd w:val="clear" w:color="auto" w:fill="FFFFFF"/>
+              </w:rPr>
+              <w:t xml:space="preserve"> (predicted to stay and actually stayed, saved lifetime value less the cost of retention offer).</w:t>
+            </w:r>
+          </w:p>
+          <w:p>
+            <w:pPr>
+              <w:spacing w:before="120" w:after="120"/>
+              <w:ind w:left="720"/>
+              <w:rPr>
+                <w:rFonts w:ascii="Cambria" w:hAnsi="Cambria" w:cs="Noto"/>
+                <w:shd w:val="clear" w:color="auto" w:fill="FFFFFF"/>
+              </w:rPr>
+            </w:pPr>
+            <w:r>
+              <w:rPr>
+                <w:rFonts w:ascii="Cambria" w:hAnsi="Cambria" w:cs="Noto"/>
+                <w:shd w:val="clear" w:color="auto" w:fill="FFFFFF"/>
+              </w:rPr>
+              <w:t>In this particular case of customer churn, missing churners (</w:t>
+            </w:r>
+            <w:r>
+              <w:rPr>
+                <w:rFonts w:ascii="Courier New" w:hAnsi="Courier New" w:cs="Courier New"/>
+                <w:sz w:val="21"/>
+                <w:szCs w:val="21"/>
+              </w:rPr>
+              <w:t>Recall</w:t>
+            </w:r>
+            <w:r>
+              <w:rPr>
+                <w:rFonts w:ascii="Cambria" w:hAnsi="Cambria" w:cs="Noto"/>
+                <w:shd w:val="clear" w:color="auto" w:fill="FFFFFF"/>
+              </w:rPr>
+              <w:t>) is more expensive than false alarms (precision). Recall is, therefore, optimized at the expense of precision and accuracy.</w:t>
+            </w:r>
+          </w:p>
+          <w:p>
+            <w:pPr>
+              <w:spacing w:before="120" w:after="120"/>
+              <w:ind w:left="720"/>
+              <w:rPr>
+                <w:rFonts w:ascii="Cambria" w:hAnsi="Cambria"/>
+                <w:shd w:val="clear" w:color="auto" w:fill="FFFFFF"/>
+              </w:rPr>
+            </w:pPr>
+            <w:r>
+              <w:rPr>
+                <w:rFonts w:ascii="Cambria" w:hAnsi="Cambria"/>
+                <w:shd w:val="clear" w:color="auto" w:fill="FFFFFF"/>
+              </w:rPr>
+              <w:t>Prediction is demonstrated using samples from the test data.</w:t>
+            </w:r>
+          </w:p>
+          <w:p>
+            <w:pPr>
+              <w:spacing w:before="120" w:after="120"/>
+              <w:ind w:left="720"/>
+              <w:rPr>
+                <w:rFonts w:ascii="Cambria" w:hAnsi="Cambria" w:cs="Courier New"/>
+                <w:color w:val="000000"/>
+              </w:rPr>
+            </w:pPr>
+            <w:r>
+              <w:rPr>
+                <w:rFonts w:ascii="Cambria" w:hAnsi="Cambria"/>
+                <w:shd w:val="clear" w:color="auto" w:fill="FFFFFF"/>
+              </w:rPr>
+              <w:t xml:space="preserve">Identification of customers likely to churn is also </w:t>
+            </w:r>
+            <w:r>
+              <w:rPr>
+                <w:rFonts w:ascii="Cambria" w:hAnsi="Cambria"/>
+                <w:shd w:val="clear" w:color="auto" w:fill="FFFFFF"/>
+              </w:rPr>
+              <w:t>shown</w:t>
+            </w:r>
+            <w:r>
+              <w:rPr>
+                <w:rFonts w:ascii="Cambria" w:hAnsi="Cambria"/>
+                <w:shd w:val="clear" w:color="auto" w:fill="FFFFFF"/>
+              </w:rPr>
+              <w:t>.</w:t>
+            </w:r>
+            <w:r>
+              <w:rPr>
+                <w:rFonts w:ascii="Cambria" w:hAnsi="Cambria" w:cs="Courier New"/>
+                <w:color w:val="000000"/>
+              </w:rPr>
+              <w:t xml:space="preserve">    </w:t>
+            </w:r>
+          </w:p>
+          <w:p>
+            <w:pPr>
+              <w:shd w:val="clear" w:color="auto" w:fill="FFFFFF"/>
+              <w:spacing w:after="120" w:line="300" w:lineRule="atLeast"/>
+              <w:ind w:left="720"/>
+              <w:rPr>
+                <w:rFonts w:ascii="Cambria" w:hAnsi="Cambria" w:cs="Courier New"/>
+                <w:color w:val="000000"/>
+              </w:rPr>
+            </w:pPr>
+            <w:r>
+              <w:rPr>
+                <w:rFonts w:ascii="Cambria" w:hAnsi="Cambria" w:cs="Courier New"/>
+                <w:color w:val="000000"/>
+              </w:rPr>
+              <w:t>Model hyperparameters are optimized using grid search</w:t>
+            </w:r>
+            <w:r>
+              <w:rPr>
+                <w:rFonts w:ascii="Cambria" w:hAnsi="Cambria" w:cs="Courier New"/>
+                <w:color w:val="000000"/>
+              </w:rPr>
+              <w:t xml:space="preserve"> </w:t>
+            </w:r>
+            <w:r>
+              <w:rPr>
+                <w:rFonts w:ascii="Cambria" w:hAnsi="Cambria" w:cs="Courier New"/>
+                <w:color w:val="000000"/>
+              </w:rPr>
+              <w:t>to maximize model performance particularly addressing overfitting</w:t>
+            </w:r>
+            <w:r>
+              <w:rPr>
+                <w:rFonts w:ascii="Cambria" w:hAnsi="Cambria" w:cs="Courier New"/>
+                <w:color w:val="000000"/>
+              </w:rPr>
+              <w:t>.</w:t>
+            </w:r>
+          </w:p>
+          <w:p>
+            <w:pPr>
+              <w:shd w:val="clear" w:color="auto" w:fill="FFFFFF"/>
+              <w:spacing w:after="120" w:line="300" w:lineRule="atLeast"/>
+              <w:ind w:left="720"/>
+              <w:rPr>
+                <w:rFonts w:ascii="Cambria" w:hAnsi="Cambria" w:cs="Courier New"/>
+                <w:color w:val="000000"/>
+              </w:rPr>
+            </w:pPr>
+            <w:r>
+              <w:rPr>
+                <w:rFonts w:ascii="Cambria" w:hAnsi="Cambria" w:cs="Courier New"/>
+                <w:color w:val="000000"/>
+              </w:rPr>
+              <w:t xml:space="preserve">Feature selection of encoded features reduces the number of features by </w:t>
+            </w:r>
+            <w:r>
+              <w:rPr>
+                <w:rFonts w:ascii="Cambria" w:hAnsi="Cambria" w:cs="Courier New"/>
+                <w:color w:val="000000"/>
+              </w:rPr>
+              <w:t>around 40% to improve the model and to lessen noise. When there is less noise, the interpretability of feature importance improves.</w:t>
+            </w:r>
+            <w:r>
+              <w:rPr>
+                <w:rFonts w:ascii="Cambria" w:hAnsi="Cambria" w:cs="Courier New"/>
+                <w:color w:val="000000"/>
+              </w:rPr>
+              <w:t xml:space="preserve"> Noise in this context is irrelevant information that obscures underlying patterns or relationships the model is trying to learn.    </w:t>
+            </w:r>
+          </w:p>
+          <w:p>
+            <w:pPr>
+              <w:shd w:val="clear" w:color="auto" w:fill="FFFFFF"/>
+              <w:spacing w:after="120" w:line="300" w:lineRule="atLeast"/>
+              <w:ind w:left="720"/>
+              <w:rPr>
+                <w:rFonts w:ascii="Cambria" w:hAnsi="Cambria" w:cs="Courier New"/>
+                <w:color w:val="000000"/>
+              </w:rPr>
+            </w:pPr>
+            <w:r>
+              <w:rPr>
+                <w:rFonts w:ascii="Cambria" w:hAnsi="Cambria" w:cs="Noto"/>
+                <w:shd w:val="clear" w:color="auto" w:fill="FFFFFF"/>
+              </w:rPr>
+              <w:t>The features and their importances are identified particularly those features whose increase or decrease correspondingly raise or lower the likelihood of customer churn.</w:t>
+            </w:r>
+            <w:r>
+              <w:rPr>
+                <w:rFonts w:ascii="Cambria" w:hAnsi="Cambria" w:cs="Noto"/>
+                <w:shd w:val="clear" w:color="auto" w:fill="FFFFFF"/>
+              </w:rPr>
+              <w:t xml:space="preserve"> </w:t>
+            </w:r>
+            <w:r>
+              <w:rPr>
+                <w:rFonts w:ascii="Cambria" w:hAnsi="Cambria" w:cs="Courier New"/>
+                <w:color w:val="000000"/>
+              </w:rPr>
+              <w:t xml:space="preserve">The features and their importances are determined to verify the magnitude of features influence.      </w:t>
+            </w:r>
+          </w:p>
+          <w:p>
+            <w:pPr>
+              <w:ind w:left="720"/>
+              <w:rPr>
+                <w:rFonts w:ascii="Cambria" w:hAnsi="Cambria"/>
+              </w:rPr>
+            </w:pPr>
+            <w:r>
+              <w:rPr>
+                <w:rFonts w:ascii="Cambria" w:hAnsi="Cambria" w:cs="Courier New"/>
+                <w:color w:val="000000"/>
+              </w:rPr>
+              <w:t>After feature selection, the results of feature importance from the top three (3) models are fed to a Gen</w:t>
+            </w:r>
+            <w:r>
+              <w:rPr>
+                <w:rFonts w:ascii="Cambria" w:hAnsi="Cambria" w:cs="Courier New"/>
+                <w:color w:val="000000"/>
+              </w:rPr>
+              <w:t>erative</w:t>
+            </w:r>
+            <w:r>
+              <w:rPr>
+                <w:rFonts w:ascii="Cambria" w:hAnsi="Cambria" w:cs="Courier New"/>
+                <w:color w:val="000000"/>
+              </w:rPr>
+              <w:t xml:space="preserve"> AI </w:t>
+            </w:r>
+            <w:r>
+              <w:rPr>
+                <w:rFonts w:ascii="Cambria" w:hAnsi="Cambria" w:cs="Courier New"/>
+                <w:color w:val="000000"/>
+              </w:rPr>
+              <w:t xml:space="preserve">(GenAI) </w:t>
+            </w:r>
+            <w:r>
+              <w:rPr>
+                <w:rFonts w:ascii="Cambria" w:hAnsi="Cambria" w:cs="Courier New"/>
+                <w:color w:val="000000"/>
+              </w:rPr>
+              <w:t xml:space="preserve">model for interpretation. </w:t>
+            </w:r>
+            <w:r>
+              <w:rPr>
+                <w:rFonts w:ascii="Cambria" w:hAnsi="Cambria" w:cs="Noto"/>
+                <w:color w:val="1F1F1F"/>
+                <w:shd w:val="clear" w:color="auto" w:fill="FFFFFF"/>
+              </w:rPr>
+              <w:t xml:space="preserve">The codes are </w:t>
+            </w:r>
+            <w:r>
+              <w:rPr>
+                <w:rFonts w:ascii="Cambria" w:hAnsi="Cambria" w:cs="Noto"/>
+                <w:color w:val="1F1F1F"/>
                 <w:shd w:val="clear" w:color="auto" w:fill="FFFFFF"/>
               </w:rPr>
               <w:lastRenderedPageBreak/>
-              <w:t xml:space="preserve">to churn but stayed, cost of retention offer) and </w:t>
-            </w:r>
-            <w:r>
-              <w:rPr>
-                <w:rFonts w:ascii="Courier New" w:hAnsi="Courier New" w:cs="Courier New"/>
-                <w:sz w:val="21"/>
-                <w:szCs w:val="21"/>
-                <w:shd w:val="clear" w:color="auto" w:fill="FFFFFF"/>
-              </w:rPr>
-              <w:t>true positives</w:t>
-            </w:r>
-            <w:r>
-              <w:rPr>
-                <w:rFonts w:ascii="Cambria" w:hAnsi="Cambria" w:cs="Noto"/>
-                <w:shd w:val="clear" w:color="auto" w:fill="FFFFFF"/>
-              </w:rPr>
-              <w:t xml:space="preserve"> (predicted to stay and actually stayed, saved lifetime value less the cost of retention offer).</w:t>
-            </w:r>
-          </w:p>
-          <w:p>
-            <w:pPr>
-              <w:spacing w:before="120" w:after="120"/>
-              <w:ind w:left="720"/>
-              <w:rPr>
-                <w:rFonts w:ascii="Cambria" w:hAnsi="Cambria" w:cs="Noto"/>
-                <w:shd w:val="clear" w:color="auto" w:fill="FFFFFF"/>
-              </w:rPr>
-            </w:pPr>
-            <w:r>
-              <w:rPr>
-                <w:rFonts w:ascii="Cambria" w:hAnsi="Cambria" w:cs="Noto"/>
-                <w:shd w:val="clear" w:color="auto" w:fill="FFFFFF"/>
-              </w:rPr>
-              <w:t>In this particular case of customer churn, missing churners (</w:t>
-            </w:r>
-            <w:r>
-              <w:rPr>
-                <w:rFonts w:ascii="Courier New" w:hAnsi="Courier New" w:cs="Courier New"/>
-                <w:sz w:val="21"/>
-                <w:szCs w:val="21"/>
-              </w:rPr>
-              <w:t>Recall</w:t>
-            </w:r>
-            <w:r>
-              <w:rPr>
-                <w:rFonts w:ascii="Cambria" w:hAnsi="Cambria" w:cs="Noto"/>
-                <w:shd w:val="clear" w:color="auto" w:fill="FFFFFF"/>
-              </w:rPr>
-              <w:t>) is more expensive than false alarms (precision). Recall is, therefore, optimized at the expense of precision and accuracy.</w:t>
-            </w:r>
-          </w:p>
-          <w:p>
-            <w:pPr>
-              <w:spacing w:before="120" w:after="120"/>
-              <w:ind w:left="720"/>
-              <w:rPr>
-                <w:rFonts w:ascii="Cambria" w:hAnsi="Cambria"/>
-                <w:shd w:val="clear" w:color="auto" w:fill="FFFFFF"/>
-              </w:rPr>
-            </w:pPr>
-            <w:r>
-              <w:rPr>
-                <w:rFonts w:ascii="Cambria" w:hAnsi="Cambria"/>
-                <w:shd w:val="clear" w:color="auto" w:fill="FFFFFF"/>
-              </w:rPr>
-              <w:t>Prediction is demonstrated using samples from the test data.</w:t>
-            </w:r>
-          </w:p>
-          <w:p>
-            <w:pPr>
-              <w:spacing w:before="120" w:after="120"/>
-              <w:ind w:left="720"/>
-              <w:rPr>
-                <w:rFonts w:ascii="Cambria" w:hAnsi="Cambria" w:cs="Courier New"/>
-                <w:color w:val="000000"/>
-              </w:rPr>
-            </w:pPr>
-            <w:r>
-              <w:rPr>
-                <w:rFonts w:ascii="Cambria" w:hAnsi="Cambria"/>
-                <w:shd w:val="clear" w:color="auto" w:fill="FFFFFF"/>
-              </w:rPr>
-              <w:t xml:space="preserve">Identification of customers likely to churn is also </w:t>
-            </w:r>
-            <w:r>
-              <w:rPr>
-                <w:rFonts w:ascii="Cambria" w:hAnsi="Cambria"/>
-                <w:shd w:val="clear" w:color="auto" w:fill="FFFFFF"/>
-              </w:rPr>
-              <w:t>shown</w:t>
-            </w:r>
-            <w:r>
-              <w:rPr>
-                <w:rFonts w:ascii="Cambria" w:hAnsi="Cambria"/>
-                <w:shd w:val="clear" w:color="auto" w:fill="FFFFFF"/>
-              </w:rPr>
-              <w:t>.</w:t>
-            </w:r>
-            <w:r>
-              <w:rPr>
-                <w:rFonts w:ascii="Cambria" w:hAnsi="Cambria" w:cs="Courier New"/>
-                <w:color w:val="000000"/>
-              </w:rPr>
-              <w:t xml:space="preserve">    </w:t>
-            </w:r>
-          </w:p>
-          <w:p>
-            <w:pPr>
-              <w:shd w:val="clear" w:color="auto" w:fill="FFFFFF"/>
-              <w:spacing w:after="120" w:line="300" w:lineRule="atLeast"/>
-              <w:ind w:left="720"/>
-              <w:rPr>
-                <w:rFonts w:ascii="Cambria" w:hAnsi="Cambria" w:cs="Courier New"/>
-                <w:color w:val="000000"/>
-              </w:rPr>
-            </w:pPr>
-            <w:r>
-              <w:rPr>
-                <w:rFonts w:ascii="Cambria" w:hAnsi="Cambria" w:cs="Courier New"/>
-                <w:color w:val="000000"/>
-              </w:rPr>
-              <w:t>Model hyperparameters are optimized using grid search</w:t>
-            </w:r>
-            <w:r>
-              <w:rPr>
-                <w:rFonts w:ascii="Cambria" w:hAnsi="Cambria" w:cs="Courier New"/>
-                <w:color w:val="000000"/>
-              </w:rPr>
-              <w:t xml:space="preserve"> </w:t>
-            </w:r>
-            <w:r>
-              <w:rPr>
-                <w:rFonts w:ascii="Cambria" w:hAnsi="Cambria" w:cs="Courier New"/>
-                <w:color w:val="000000"/>
-              </w:rPr>
-              <w:t>to maximize model performance particularly addressing overfitting</w:t>
-            </w:r>
-            <w:r>
-              <w:rPr>
-                <w:rFonts w:ascii="Cambria" w:hAnsi="Cambria" w:cs="Courier New"/>
-                <w:color w:val="000000"/>
-              </w:rPr>
-              <w:t>.</w:t>
-            </w:r>
-          </w:p>
-          <w:p>
-            <w:pPr>
-              <w:shd w:val="clear" w:color="auto" w:fill="FFFFFF"/>
-              <w:spacing w:after="120" w:line="300" w:lineRule="atLeast"/>
-              <w:ind w:left="720"/>
-              <w:rPr>
-                <w:rFonts w:ascii="Cambria" w:hAnsi="Cambria" w:cs="Courier New"/>
-                <w:color w:val="000000"/>
-              </w:rPr>
-            </w:pPr>
-            <w:r>
-              <w:rPr>
-                <w:rFonts w:ascii="Cambria" w:hAnsi="Cambria" w:cs="Courier New"/>
-                <w:color w:val="000000"/>
-              </w:rPr>
-              <w:t xml:space="preserve">Feature selection of encoded features reduces the number of features by </w:t>
-            </w:r>
-            <w:r>
-              <w:rPr>
-                <w:rFonts w:ascii="Cambria" w:hAnsi="Cambria" w:cs="Courier New"/>
-                <w:color w:val="000000"/>
-              </w:rPr>
-              <w:t>around 40% to improve the model and to lessen noise. When there is less noise, the interpretability of feature importance improves.</w:t>
-            </w:r>
-            <w:r>
-              <w:rPr>
-                <w:rFonts w:ascii="Cambria" w:hAnsi="Cambria" w:cs="Courier New"/>
-                <w:color w:val="000000"/>
-              </w:rPr>
-              <w:t xml:space="preserve"> Noise in this context is irrelevant information that obscures underlying patterns or relationships the model is trying to learn.    </w:t>
-            </w:r>
-          </w:p>
-          <w:p>
-            <w:pPr>
-              <w:shd w:val="clear" w:color="auto" w:fill="FFFFFF"/>
-              <w:spacing w:after="120" w:line="300" w:lineRule="atLeast"/>
-              <w:ind w:left="720"/>
-              <w:rPr>
-                <w:rFonts w:ascii="Cambria" w:hAnsi="Cambria" w:cs="Courier New"/>
-                <w:color w:val="000000"/>
-              </w:rPr>
-            </w:pPr>
-            <w:r>
-              <w:rPr>
-                <w:rFonts w:ascii="Cambria" w:hAnsi="Cambria" w:cs="Noto"/>
-                <w:shd w:val="clear" w:color="auto" w:fill="FFFFFF"/>
-              </w:rPr>
-              <w:t>The features and their importances are identified particularly those features whose increase or decrease correspondingly raise or lower the likelihood of customer churn.</w:t>
-            </w:r>
-            <w:r>
-              <w:rPr>
-                <w:rFonts w:ascii="Cambria" w:hAnsi="Cambria" w:cs="Noto"/>
-                <w:shd w:val="clear" w:color="auto" w:fill="FFFFFF"/>
-              </w:rPr>
-              <w:t xml:space="preserve"> </w:t>
-            </w:r>
-            <w:r>
-              <w:rPr>
-                <w:rFonts w:ascii="Cambria" w:hAnsi="Cambria" w:cs="Courier New"/>
-                <w:color w:val="000000"/>
-              </w:rPr>
-              <w:t xml:space="preserve">The features and their importances are determined to verify the magnitude of features influence.      </w:t>
-            </w:r>
-          </w:p>
-          <w:p>
-            <w:pPr>
-              <w:ind w:left="720"/>
-              <w:rPr>
-                <w:rFonts w:ascii="Cambria" w:hAnsi="Cambria"/>
-              </w:rPr>
-            </w:pPr>
-            <w:bookmarkStart w:id="0" w:name="_GoBack"/>
-            <w:bookmarkEnd w:id="0"/>
-            <w:r>
-              <w:rPr>
-                <w:rFonts w:ascii="Cambria" w:hAnsi="Cambria" w:cs="Courier New"/>
-                <w:color w:val="000000"/>
-              </w:rPr>
-              <w:t>After feature selection, the results of feature importance from the top three (3) models are fed to a Gen</w:t>
-            </w:r>
-            <w:r>
-              <w:rPr>
-                <w:rFonts w:ascii="Cambria" w:hAnsi="Cambria" w:cs="Courier New"/>
-                <w:color w:val="000000"/>
-              </w:rPr>
-              <w:t>erative</w:t>
-            </w:r>
-            <w:r>
-              <w:rPr>
-                <w:rFonts w:ascii="Cambria" w:hAnsi="Cambria" w:cs="Courier New"/>
-                <w:color w:val="000000"/>
-              </w:rPr>
-              <w:t xml:space="preserve"> AI </w:t>
-            </w:r>
-            <w:r>
-              <w:rPr>
-                <w:rFonts w:ascii="Cambria" w:hAnsi="Cambria" w:cs="Courier New"/>
-                <w:color w:val="000000"/>
-              </w:rPr>
-              <w:t xml:space="preserve">(GenAI) </w:t>
-            </w:r>
-            <w:r>
-              <w:rPr>
-                <w:rFonts w:ascii="Cambria" w:hAnsi="Cambria" w:cs="Courier New"/>
-                <w:color w:val="000000"/>
-              </w:rPr>
-              <w:t xml:space="preserve">model for interpretation. </w:t>
-            </w:r>
-            <w:r>
-              <w:rPr>
-                <w:rFonts w:ascii="Cambria" w:hAnsi="Cambria" w:cs="Noto"/>
-                <w:color w:val="1F1F1F"/>
-                <w:shd w:val="clear" w:color="auto" w:fill="FFFFFF"/>
-              </w:rPr>
-              <w:t>The codes are commented because the API key can only be accessed locally. However, the Gen AI narrative is captured and shown.</w:t>
+              <w:t>commented because the API key can only be accessed locally. However, the Gen AI narrative is captured and shown.</w:t>
             </w:r>
           </w:p>
           <w:p>
@@ -3377,14 +3362,14 @@
               <w:rPr>
                 <w:rFonts w:ascii="Cambria" w:hAnsi="Cambria" w:cs="Courier New"/>
               </w:rPr>
-              <w:t xml:space="preserve">"Based on the feature importance data, here are some key insights and observations: Top Important Features: 1. csat_score (0.884): The customer satisfaction score is the most important feature, indicating that customer satisfaction is a critical factor in predicting customer churn. This suggests that addressing customer concerns and improving overall customer experience can help retain customers. 2. tenure_months (0.882): Customer tenure is the second </w:t>
+              <w:t xml:space="preserve">"Based on the feature importance data, here are some key insights and observations: Top Important Features: 1. csat_score (0.884): The customer satisfaction score is the most important feature, indicating that customer satisfaction is a critical factor in predicting customer churn. This suggests that addressing customer concerns and improving overall customer experience can help retain customers. 2. tenure_months (0.882): Customer tenure is the second most important feature, indicating that longer-term customers are more likely to churn. This suggests that customers who have been with the company for a long time may be more at risk of leaving. 3. payment_failures (0.544): Payment failures are an important indicator of customer churn. This suggests that issues related to payment processing, billing, or financial difficulties can lead to customer dissatisfaction and churn. Features with Moderate Importance: 1. monthly_logins (0.480): Monthly logins indicate customer engagement, and a lack of engagement (i.e., infrequent logins) can be a sign of churn. This suggests that customers who are not actively using the service may be more likely to leave. 2. tenure_fee_interaction (0.312): The way tenure intersects with fee-related issues (e.g., pricing, pricing changes) seems to be somewhat significant, however, the exact relationship between these is unclear. Features with Lower Importance: 1. country_Bangladesh (0.129): The country of residence has a relatively low importance in predicting customer churn. This suggests that geographic location may not be a significant factor in determining customer loyalty. 2. escalations (0.126): Escalations (i.e., issues escalated to higher-level support) are not a significant predictor of customer churn. This suggests that while escalations may indicate quality issues, they are not a primary driver of churn. 3. email_open_rate (0.111): Customer engagement metrics (e.g., email open rates) are relatively low in importance, indicating that they may not be a significant predictor of customer churn. 4. city_Berlin (0.093): The city of residence also has a relatively low </w:t>
             </w:r>
             <w:r>
               <w:rPr>
                 <w:rFonts w:ascii="Cambria" w:hAnsi="Cambria" w:cs="Courier New"/>
               </w:rPr>
               <w:lastRenderedPageBreak/>
-              <w:t>most important feature, indicating that longer-term customers are more likely to churn. This suggests that customers who have been with the company for a long time may be more at risk of leaving. 3. payment_failures (0.544): Payment failures are an important indicator of customer churn. This suggests that issues related to payment processing, billing, or financial difficulties can lead to customer dissatisfaction and churn. Features with Moderate Importance: 1. monthly_logins (0.480): Monthly logins indicate customer engagement, and a lack of engagement (i.e., infrequent logins) can be a sign of churn. This suggests that customers who are not actively using the service may be more likely to leave. 2. tenure_fee_interaction (0.312): The way tenure intersects with fee-related issues (e.g., pricing, pricing changes) seems to be somewhat significant, however, the exact relationship between these is unclear. Features with Lower Importance: 1. country_Bangladesh (0.129): The country of residence has a relatively low importance in predicting customer churn. This suggests that geographic location may not be a significant factor in determining customer loyalty. 2. escalations (0.126): Escalations (i.e., issues escalated to higher-level support) are not a significant predictor of customer churn. This suggests that while escalations may indicate quality issues, they are not a primary driver of churn. 3. email_open_rate (0.111): Customer engagement metrics (e.g., email open rates) are relatively low in importance, indicating that they may not be a significant predictor of customer churn. 4. city_Berlin (0.093): The city of residence also has a relatively low importance in predicting customer churn. 5. city_London (0.067): Like other geographic features, the city of London has a low importance in predicting customer churn. Takeaways: 1. Focus on customer satisfaction and experience: The high importance of csat_score suggests that improving customer satisfaction through better support, communication, and quality is critical. 2. Pay attention to payment and billing: Payment failures and issues related to payment processing can lead to churn, so addressing these issues is essential. 3. Monitor engagement metrics: While not as critical, monthly logins and email open rates can still indicate customer engagement or disengagement, which may be useful in early identification of potential churn. 4. Consider tenure-based insights: Analyze customer tenure to identify potential churn risks, and consider ways to retain long-term customers (e.g., loyalty programs, special offers). 5. Rethink geographic factors: The relatively low importance of geographic features (e.g., country, city) suggests that they may not be significant drivers of customer churn."</w:t>
+              <w:t>importance in predicting customer churn. 5. city_London (0.067): Like other geographic features, the city of London has a low importance in predicting customer churn. Takeaways: 1. Focus on customer satisfaction and experience: The high importance of csat_score suggests that improving customer satisfaction through better support, communication, and quality is critical. 2. Pay attention to payment and billing: Payment failures and issues related to payment processing can lead to churn, so addressing these issues is essential. 3. Monitor engagement metrics: While not as critical, monthly logins and email open rates can still indicate customer engagement or disengagement, which may be useful in early identification of potential churn. 4. Consider tenure-based insights: Analyze customer tenure to identify potential churn risks, and consider ways to retain long-term customers (e.g., loyalty programs, special offers). 5. Rethink geographic factors: The relatively low importance of geographic features (e.g., country, city) suggests that they may not be significant drivers of customer churn."</w:t>
             </w:r>
             <w:r>
               <w:rPr>
@@ -3488,7 +3473,6 @@
                 <w:bCs/>
                 <w:color w:val="000000"/>
               </w:rPr>
-              <w:lastRenderedPageBreak/>
               <w:t>XGBoost Classifier</w:t>
             </w:r>
             <w:r>
@@ -3696,6 +3680,7 @@
             <w:r>
               <w:rPr>
                 <w:rFonts w:ascii="Cambria" w:hAnsi="Cambria" w:cs="Courier New"/>
+                <w:noProof/>
                 <w:color w:val="000000"/>
               </w:rPr>
               <w:drawing>
@@ -3753,11 +3738,13 @@
                 <w:rFonts w:ascii="Cambria" w:hAnsi="Cambria" w:cs="Courier New"/>
                 <w:color w:val="000000"/>
               </w:rPr>
+              <w:lastRenderedPageBreak/>
               <w:tab/>
             </w:r>
             <w:r>
               <w:rPr>
                 <w:rFonts w:ascii="Cambria" w:hAnsi="Cambria" w:cs="Courier New"/>
+                <w:noProof/>
                 <w:color w:val="000000"/>
               </w:rPr>
               <w:drawing>
@@ -3877,7 +3864,6 @@
               <w:rPr>
                 <w:rFonts w:ascii="Cambria" w:hAnsi="Cambria" w:cs="Courier New"/>
               </w:rPr>
-              <w:lastRenderedPageBreak/>
               <w:t>- Continue model development to include actual identification of clients who are likely to churn.</w:t>
             </w:r>
           </w:p>
@@ -3948,14 +3934,14 @@
         </w:tc>
       </w:tr>
     </w:tbl>
-    <w:p/>
+    <w:p>
+      <w:bookmarkStart w:id="0" w:name="_GoBack"/>
+      <w:bookmarkEnd w:id="0"/>
+    </w:p>
     <w:sectPr>
-      <w:headerReference w:type="even" r:id="rId9"/>
-      <w:headerReference w:type="default" r:id="rId10"/>
-      <w:footerReference w:type="even" r:id="rId11"/>
-      <w:footerReference w:type="default" r:id="rId12"/>
-      <w:headerReference w:type="first" r:id="rId13"/>
-      <w:footerReference w:type="first" r:id="rId14"/>
+      <w:headerReference w:type="default" r:id="rId9"/>
+      <w:footerReference w:type="even" r:id="rId10"/>
+      <w:footerReference w:type="default" r:id="rId11"/>
       <w:pgSz w:w="12240" w:h="15840"/>
       <w:pgMar w:top="1440" w:right="1440" w:bottom="1440" w:left="1440" w:header="720" w:footer="720" w:gutter="0"/>
       <w:pgNumType w:start="1"/>
@@ -4118,17 +4104,208 @@
     </w:r>
   </w:p>
   <w:p>
-    <w:pPr>
-      <w:rPr>
-        <w:rFonts w:ascii="Cambria" w:hAnsi="Cambria"/>
-      </w:rPr>
-    </w:pPr>
     <w:r>
       <w:rPr>
         <w:rFonts w:ascii="Cambria" w:hAnsi="Cambria"/>
       </w:rPr>
-      <w:t xml:space="preserve">                     Customer_Churn_Prediction.ipynb</w:t>
+      <w:t xml:space="preserve">                     </w:t>
     </w:r>
+    <w:r>
+      <w:fldChar w:fldCharType="begin"/>
+    </w:r>
+    <w:r>
+      <w:instrText xml:space="preserve"> HYPERLINK "https://github.com/RonaldoBantayan27/SierraMadre/blob/main/01_EDA_Customer_Churn_Prediction.ipynb" </w:instrText>
+    </w:r>
+    <w:r>
+      <w:fldChar w:fldCharType="separate"/>
+    </w:r>
+    <w:r>
+      <w:rPr>
+        <w:rFonts w:ascii="Noto Sans" w:hAnsi="Noto Sans" w:cs="Noto Sans"/>
+        <w:color w:val="0000FF"/>
+        <w:u w:val="single"/>
+      </w:rPr>
+      <w:t>Exp</w:t>
+    </w:r>
+    <w:r>
+      <w:rPr>
+        <w:rFonts w:ascii="Noto Sans" w:hAnsi="Noto Sans" w:cs="Noto Sans"/>
+        <w:color w:val="0000FF"/>
+        <w:u w:val="single"/>
+      </w:rPr>
+      <w:t>l</w:t>
+    </w:r>
+    <w:r>
+      <w:rPr>
+        <w:rFonts w:ascii="Noto Sans" w:hAnsi="Noto Sans" w:cs="Noto Sans"/>
+        <w:color w:val="0000FF"/>
+        <w:u w:val="single"/>
+      </w:rPr>
+      <w:t>oratory Data</w:t>
+    </w:r>
+    <w:r>
+      <w:rPr>
+        <w:rFonts w:ascii="Noto Sans" w:hAnsi="Noto Sans" w:cs="Noto Sans"/>
+        <w:color w:val="0000FF"/>
+        <w:u w:val="single"/>
+      </w:rPr>
+      <w:t xml:space="preserve"> </w:t>
+    </w:r>
+    <w:r>
+      <w:rPr>
+        <w:rFonts w:ascii="Noto Sans" w:hAnsi="Noto Sans" w:cs="Noto Sans"/>
+        <w:color w:val="0000FF"/>
+        <w:u w:val="single"/>
+      </w:rPr>
+      <w:t>A</w:t>
+    </w:r>
+    <w:r>
+      <w:rPr>
+        <w:rFonts w:ascii="Noto Sans" w:hAnsi="Noto Sans" w:cs="Noto Sans"/>
+        <w:color w:val="0000FF"/>
+        <w:u w:val="single"/>
+      </w:rPr>
+      <w:t>nalysis</w:t>
+    </w:r>
+    <w:r>
+      <w:fldChar w:fldCharType="end"/>
+    </w:r>
+    <w:r>
+      <w:rPr>
+        <w:rFonts w:ascii="Noto Sans" w:hAnsi="Noto Sans" w:cs="Noto Sans"/>
+        <w:color w:val="1F2328"/>
+        <w:shd w:val="clear" w:color="auto" w:fill="FFFFFF"/>
+      </w:rPr>
+      <w:t> </w:t>
+    </w:r>
+    <w:hyperlink r:id="rId1" w:history="1">
+      <w:r>
+        <w:rPr>
+          <w:rFonts w:ascii="Noto Sans" w:hAnsi="Noto Sans" w:cs="Noto Sans"/>
+          <w:color w:val="0000FF"/>
+          <w:u w:val="single"/>
+        </w:rPr>
+        <w:t>Logistic_Regression</w:t>
+      </w:r>
+    </w:hyperlink>
+    <w:r>
+      <w:rPr>
+        <w:rFonts w:ascii="Noto Sans" w:hAnsi="Noto Sans" w:cs="Noto Sans"/>
+        <w:color w:val="1F2328"/>
+        <w:shd w:val="clear" w:color="auto" w:fill="FFFFFF"/>
+      </w:rPr>
+      <w:t> </w:t>
+    </w:r>
+    <w:hyperlink r:id="rId2" w:history="1">
+      <w:r>
+        <w:rPr>
+          <w:rFonts w:ascii="Noto Sans" w:hAnsi="Noto Sans" w:cs="Noto Sans"/>
+          <w:color w:val="0000FF"/>
+          <w:u w:val="single"/>
+        </w:rPr>
+        <w:t>Decision_Tree</w:t>
+      </w:r>
+    </w:hyperlink>
+    <w:r>
+      <w:rPr>
+        <w:rFonts w:ascii="Noto Sans" w:hAnsi="Noto Sans" w:cs="Noto Sans"/>
+        <w:color w:val="1F2328"/>
+        <w:shd w:val="clear" w:color="auto" w:fill="FFFFFF"/>
+      </w:rPr>
+      <w:t> </w:t>
+    </w:r>
+    <w:hyperlink r:id="rId3" w:history="1">
+      <w:r>
+        <w:rPr>
+          <w:rFonts w:ascii="Noto Sans" w:hAnsi="Noto Sans" w:cs="Noto Sans"/>
+          <w:color w:val="0000FF"/>
+          <w:u w:val="single"/>
+        </w:rPr>
+        <w:t>KNearest_Neighbors</w:t>
+      </w:r>
+    </w:hyperlink>
+    <w:r>
+      <w:rPr>
+        <w:rFonts w:ascii="Noto Sans" w:hAnsi="Noto Sans" w:cs="Noto Sans"/>
+        <w:color w:val="1F2328"/>
+        <w:shd w:val="clear" w:color="auto" w:fill="FFFFFF"/>
+      </w:rPr>
+      <w:t> </w:t>
+    </w:r>
+    <w:hyperlink r:id="rId4" w:history="1">
+      <w:r>
+        <w:rPr>
+          <w:rFonts w:ascii="Noto Sans" w:hAnsi="Noto Sans" w:cs="Noto Sans"/>
+          <w:color w:val="0000FF"/>
+          <w:u w:val="single"/>
+        </w:rPr>
+        <w:t>Support_Vector</w:t>
+      </w:r>
+    </w:hyperlink>
+    <w:hyperlink r:id="rId5" w:history="1">
+      <w:r>
+        <w:rPr>
+          <w:rFonts w:ascii="Noto Sans" w:hAnsi="Noto Sans" w:cs="Noto Sans"/>
+          <w:color w:val="0000FF"/>
+          <w:u w:val="single"/>
+        </w:rPr>
+        <w:t>Random_Forest</w:t>
+      </w:r>
+    </w:hyperlink>
+    <w:r>
+      <w:rPr>
+        <w:rFonts w:ascii="Noto Sans" w:hAnsi="Noto Sans" w:cs="Noto Sans"/>
+        <w:color w:val="1F2328"/>
+        <w:shd w:val="clear" w:color="auto" w:fill="FFFFFF"/>
+      </w:rPr>
+      <w:t> </w:t>
+    </w:r>
+    <w:hyperlink r:id="rId6" w:history="1">
+      <w:r>
+        <w:rPr>
+          <w:rFonts w:ascii="Noto Sans" w:hAnsi="Noto Sans" w:cs="Noto Sans"/>
+          <w:color w:val="0000FF"/>
+          <w:u w:val="single"/>
+        </w:rPr>
+        <w:t>Keras</w:t>
+      </w:r>
+    </w:hyperlink>
+    <w:r>
+      <w:rPr>
+        <w:rFonts w:ascii="Noto Sans" w:hAnsi="Noto Sans" w:cs="Noto Sans"/>
+        <w:color w:val="1F2328"/>
+        <w:shd w:val="clear" w:color="auto" w:fill="FFFFFF"/>
+      </w:rPr>
+      <w:t> </w:t>
+    </w:r>
+    <w:hyperlink r:id="rId7" w:history="1">
+      <w:r>
+        <w:rPr>
+          <w:rFonts w:ascii="Noto Sans" w:hAnsi="Noto Sans" w:cs="Noto Sans"/>
+          <w:color w:val="0000FF"/>
+          <w:u w:val="single"/>
+        </w:rPr>
+        <w:t>XGBoost</w:t>
+      </w:r>
+    </w:hyperlink>
+    <w:r>
+      <w:rPr>
+        <w:rFonts w:ascii="Noto Sans" w:hAnsi="Noto Sans" w:cs="Noto Sans"/>
+        <w:color w:val="1F2328"/>
+        <w:shd w:val="clear" w:color="auto" w:fill="FFFFFF"/>
+      </w:rPr>
+      <w:t> </w:t>
+    </w:r>
+    <w:hyperlink r:id="rId8" w:history="1">
+      <w:r>
+        <w:rPr>
+          <w:rFonts w:ascii="Noto Sans" w:hAnsi="Noto Sans" w:cs="Noto Sans"/>
+          <w:color w:val="0000FF"/>
+          <w:u w:val="single"/>
+        </w:rPr>
+        <w:t>Summary</w:t>
+      </w:r>
+    </w:hyperlink>
   </w:p>
   <w:p>
     <w:pPr>
@@ -4205,16 +4382,6 @@
 </w:ftr>
 </file>
 
-<file path=word/footer3.xml><?xml version="1.0" encoding="utf-8"?>
-<w:ftr xmlns:wpc="http://schemas.microsoft.com/office/word/2010/wordprocessingCanvas" xmlns:cx="http://schemas.microsoft.com/office/drawing/2014/chartex" xmlns:cx1="http://schemas.microsoft.com/office/drawing/2015/9/8/chartex" xmlns:cx2="http://schemas.microsoft.com/office/drawing/2015/10/21/chartex" xmlns:cx3="http://schemas.microsoft.com/office/drawing/2016/5/9/chartex" xmlns:cx4="http://schemas.microsoft.com/office/drawing/2016/5/10/chartex" xmlns:cx5="http://schemas.microsoft.com/office/drawing/2016/5/11/chartex" xmlns:cx6="http://schemas.microsoft.com/office/drawing/2016/5/12/chartex" xmlns:cx7="http://schemas.microsoft.com/office/drawing/2016/5/13/chartex" xmlns:cx8="http://schemas.microsoft.com/office/drawing/2016/5/14/chartex" xmlns:mc="http://schemas.openxmlformats.org/markup-compatibility/2006" xmlns:aink="http://schemas.microsoft.com/office/drawing/2016/ink" xmlns:am3d="http://schemas.microsoft.com/office/drawing/2017/model3d" xmlns:o="urn:schemas-microsoft-com:office:office" xmlns:r="http://schemas.openxmlformats.org/officeDocument/2006/relationships" xmlns:m="http://schemas.openxmlformats.org/officeDocument/2006/math" xmlns:v="urn:schemas-microsoft-com:vml" xmlns:wp14="http://schemas.microsoft.com/office/word/2010/wordprocessingDrawing" xmlns:wp="http://schemas.openxmlformats.org/drawingml/2006/wordprocessingDrawing" xmlns:w10="urn:schemas-microsoft-com:office:word" xmlns:w="http://schemas.openxmlformats.org/wordprocessingml/2006/main" xmlns:w14="http://schemas.microsoft.com/office/word/2010/wordml" xmlns:w15="http://schemas.microsoft.com/office/word/2012/wordml" xmlns:w16cid="http://schemas.microsoft.com/office/word/2016/wordml/cid" xmlns:w16se="http://schemas.microsoft.com/office/word/2015/wordml/symex" xmlns:wpg="http://schemas.microsoft.com/office/word/2010/wordprocessingGroup" xmlns:wpi="http://schemas.microsoft.com/office/word/2010/wordprocessingInk" xmlns:wne="http://schemas.microsoft.com/office/word/2006/wordml" xmlns:wps="http://schemas.microsoft.com/office/word/2010/wordprocessingShape" mc:Ignorable="w14 w15 w16se w16cid wp14">
-  <w:p>
-    <w:pPr>
-      <w:pStyle w:val="Footer"/>
-    </w:pPr>
-  </w:p>
-</w:ftr>
-</file>
-
 <file path=word/footnotes.xml><?xml version="1.0" encoding="utf-8"?>
 <w:footnotes xmlns:wpc="http://schemas.microsoft.com/office/word/2010/wordprocessingCanvas" xmlns:cx="http://schemas.microsoft.com/office/drawing/2014/chartex" xmlns:cx1="http://schemas.microsoft.com/office/drawing/2015/9/8/chartex" xmlns:cx2="http://schemas.microsoft.com/office/drawing/2015/10/21/chartex" xmlns:cx3="http://schemas.microsoft.com/office/drawing/2016/5/9/chartex" xmlns:cx4="http://schemas.microsoft.com/office/drawing/2016/5/10/chartex" xmlns:cx5="http://schemas.microsoft.com/office/drawing/2016/5/11/chartex" xmlns:cx6="http://schemas.microsoft.com/office/drawing/2016/5/12/chartex" xmlns:cx7="http://schemas.microsoft.com/office/drawing/2016/5/13/chartex" xmlns:cx8="http://schemas.microsoft.com/office/drawing/2016/5/14/chartex" xmlns:mc="http://schemas.openxmlformats.org/markup-compatibility/2006" xmlns:aink="http://schemas.microsoft.com/office/drawing/2016/ink" xmlns:am3d="http://schemas.microsoft.com/office/drawing/2017/model3d" xmlns:o="urn:schemas-microsoft-com:office:office" xmlns:r="http://schemas.openxmlformats.org/officeDocument/2006/relationships" xmlns:m="http://schemas.openxmlformats.org/officeDocument/2006/math" xmlns:v="urn:schemas-microsoft-com:vml" xmlns:wp14="http://schemas.microsoft.com/office/word/2010/wordprocessingDrawing" xmlns:wp="http://schemas.openxmlformats.org/drawingml/2006/wordprocessingDrawing" xmlns:w10="urn:schemas-microsoft-com:office:word" xmlns:w="http://schemas.openxmlformats.org/wordprocessingml/2006/main" xmlns:w14="http://schemas.microsoft.com/office/word/2010/wordml" xmlns:w15="http://schemas.microsoft.com/office/word/2012/wordml" xmlns:w16cid="http://schemas.microsoft.com/office/word/2016/wordml/cid" xmlns:w16se="http://schemas.microsoft.com/office/word/2015/wordml/symex" xmlns:wpg="http://schemas.microsoft.com/office/word/2010/wordprocessingGroup" xmlns:wpi="http://schemas.microsoft.com/office/word/2010/wordprocessingInk" xmlns:wne="http://schemas.microsoft.com/office/word/2006/wordml" xmlns:wps="http://schemas.microsoft.com/office/word/2010/wordprocessingShape" mc:Ignorable="w14 w15 w16se w16cid wp14">
   <w:footnote w:type="separator" w:id="-1">
@@ -4235,16 +4402,6 @@
 </file>
 
 <file path=word/header1.xml><?xml version="1.0" encoding="utf-8"?>
-<w:hdr xmlns:wpc="http://schemas.microsoft.com/office/word/2010/wordprocessingCanvas" xmlns:cx="http://schemas.microsoft.com/office/drawing/2014/chartex" xmlns:cx1="http://schemas.microsoft.com/office/drawing/2015/9/8/chartex" xmlns:cx2="http://schemas.microsoft.com/office/drawing/2015/10/21/chartex" xmlns:cx3="http://schemas.microsoft.com/office/drawing/2016/5/9/chartex" xmlns:cx4="http://schemas.microsoft.com/office/drawing/2016/5/10/chartex" xmlns:cx5="http://schemas.microsoft.com/office/drawing/2016/5/11/chartex" xmlns:cx6="http://schemas.microsoft.com/office/drawing/2016/5/12/chartex" xmlns:cx7="http://schemas.microsoft.com/office/drawing/2016/5/13/chartex" xmlns:cx8="http://schemas.microsoft.com/office/drawing/2016/5/14/chartex" xmlns:mc="http://schemas.openxmlformats.org/markup-compatibility/2006" xmlns:aink="http://schemas.microsoft.com/office/drawing/2016/ink" xmlns:am3d="http://schemas.microsoft.com/office/drawing/2017/model3d" xmlns:o="urn:schemas-microsoft-com:office:office" xmlns:r="http://schemas.openxmlformats.org/officeDocument/2006/relationships" xmlns:m="http://schemas.openxmlformats.org/officeDocument/2006/math" xmlns:v="urn:schemas-microsoft-com:vml" xmlns:wp14="http://schemas.microsoft.com/office/word/2010/wordprocessingDrawing" xmlns:wp="http://schemas.openxmlformats.org/drawingml/2006/wordprocessingDrawing" xmlns:w10="urn:schemas-microsoft-com:office:word" xmlns:w="http://schemas.openxmlformats.org/wordprocessingml/2006/main" xmlns:w14="http://schemas.microsoft.com/office/word/2010/wordml" xmlns:w15="http://schemas.microsoft.com/office/word/2012/wordml" xmlns:w16cid="http://schemas.microsoft.com/office/word/2016/wordml/cid" xmlns:w16se="http://schemas.microsoft.com/office/word/2015/wordml/symex" xmlns:wpg="http://schemas.microsoft.com/office/word/2010/wordprocessingGroup" xmlns:wpi="http://schemas.microsoft.com/office/word/2010/wordprocessingInk" xmlns:wne="http://schemas.microsoft.com/office/word/2006/wordml" xmlns:wps="http://schemas.microsoft.com/office/word/2010/wordprocessingShape" mc:Ignorable="w14 w15 w16se w16cid wp14">
-  <w:p>
-    <w:pPr>
-      <w:pStyle w:val="Header"/>
-    </w:pPr>
-  </w:p>
-</w:hdr>
-</file>
-
-<file path=word/header2.xml><?xml version="1.0" encoding="utf-8"?>
 <w:hdr xmlns:wpc="http://schemas.microsoft.com/office/word/2010/wordprocessingCanvas" xmlns:cx="http://schemas.microsoft.com/office/drawing/2014/chartex" xmlns:cx1="http://schemas.microsoft.com/office/drawing/2015/9/8/chartex" xmlns:cx2="http://schemas.microsoft.com/office/drawing/2015/10/21/chartex" xmlns:cx3="http://schemas.microsoft.com/office/drawing/2016/5/9/chartex" xmlns:cx4="http://schemas.microsoft.com/office/drawing/2016/5/10/chartex" xmlns:cx5="http://schemas.microsoft.com/office/drawing/2016/5/11/chartex" xmlns:cx6="http://schemas.microsoft.com/office/drawing/2016/5/12/chartex" xmlns:cx7="http://schemas.microsoft.com/office/drawing/2016/5/13/chartex" xmlns:cx8="http://schemas.microsoft.com/office/drawing/2016/5/14/chartex" xmlns:mc="http://schemas.openxmlformats.org/markup-compatibility/2006" xmlns:aink="http://schemas.microsoft.com/office/drawing/2016/ink" xmlns:am3d="http://schemas.microsoft.com/office/drawing/2017/model3d" xmlns:o="urn:schemas-microsoft-com:office:office" xmlns:r="http://schemas.openxmlformats.org/officeDocument/2006/relationships" xmlns:m="http://schemas.openxmlformats.org/officeDocument/2006/math" xmlns:v="urn:schemas-microsoft-com:vml" xmlns:wp14="http://schemas.microsoft.com/office/word/2010/wordprocessingDrawing" xmlns:wp="http://schemas.openxmlformats.org/drawingml/2006/wordprocessingDrawing" xmlns:w10="urn:schemas-microsoft-com:office:word" xmlns:w="http://schemas.openxmlformats.org/wordprocessingml/2006/main" xmlns:w14="http://schemas.microsoft.com/office/word/2010/wordml" xmlns:w15="http://schemas.microsoft.com/office/word/2012/wordml" xmlns:w16cid="http://schemas.microsoft.com/office/word/2016/wordml/cid" xmlns:w16se="http://schemas.microsoft.com/office/word/2015/wordml/symex" xmlns:wpg="http://schemas.microsoft.com/office/word/2010/wordprocessingGroup" xmlns:wpi="http://schemas.microsoft.com/office/word/2010/wordprocessingInk" xmlns:wne="http://schemas.microsoft.com/office/word/2006/wordml" xmlns:wps="http://schemas.microsoft.com/office/word/2010/wordprocessingShape" mc:Ignorable="w14 w15 w16se w16cid wp14">
   <w:p>
     <w:pPr>
@@ -4301,16 +4458,6 @@
       <w:pStyle w:val="Header"/>
     </w:pPr>
   </w:p>
-  <w:p>
-    <w:pPr>
-      <w:pStyle w:val="Header"/>
-    </w:pPr>
-  </w:p>
-</w:hdr>
-</file>
-
-<file path=word/header3.xml><?xml version="1.0" encoding="utf-8"?>
-<w:hdr xmlns:wpc="http://schemas.microsoft.com/office/word/2010/wordprocessingCanvas" xmlns:cx="http://schemas.microsoft.com/office/drawing/2014/chartex" xmlns:cx1="http://schemas.microsoft.com/office/drawing/2015/9/8/chartex" xmlns:cx2="http://schemas.microsoft.com/office/drawing/2015/10/21/chartex" xmlns:cx3="http://schemas.microsoft.com/office/drawing/2016/5/9/chartex" xmlns:cx4="http://schemas.microsoft.com/office/drawing/2016/5/10/chartex" xmlns:cx5="http://schemas.microsoft.com/office/drawing/2016/5/11/chartex" xmlns:cx6="http://schemas.microsoft.com/office/drawing/2016/5/12/chartex" xmlns:cx7="http://schemas.microsoft.com/office/drawing/2016/5/13/chartex" xmlns:cx8="http://schemas.microsoft.com/office/drawing/2016/5/14/chartex" xmlns:mc="http://schemas.openxmlformats.org/markup-compatibility/2006" xmlns:aink="http://schemas.microsoft.com/office/drawing/2016/ink" xmlns:am3d="http://schemas.microsoft.com/office/drawing/2017/model3d" xmlns:o="urn:schemas-microsoft-com:office:office" xmlns:r="http://schemas.openxmlformats.org/officeDocument/2006/relationships" xmlns:m="http://schemas.openxmlformats.org/officeDocument/2006/math" xmlns:v="urn:schemas-microsoft-com:vml" xmlns:wp14="http://schemas.microsoft.com/office/word/2010/wordprocessingDrawing" xmlns:wp="http://schemas.openxmlformats.org/drawingml/2006/wordprocessingDrawing" xmlns:w10="urn:schemas-microsoft-com:office:word" xmlns:w="http://schemas.openxmlformats.org/wordprocessingml/2006/main" xmlns:w14="http://schemas.microsoft.com/office/word/2010/wordml" xmlns:w15="http://schemas.microsoft.com/office/word/2012/wordml" xmlns:w16cid="http://schemas.microsoft.com/office/word/2016/wordml/cid" xmlns:w16se="http://schemas.microsoft.com/office/word/2015/wordml/symex" xmlns:wpg="http://schemas.microsoft.com/office/word/2010/wordprocessingGroup" xmlns:wpi="http://schemas.microsoft.com/office/word/2010/wordprocessingInk" xmlns:wne="http://schemas.microsoft.com/office/word/2006/wordml" xmlns:wps="http://schemas.microsoft.com/office/word/2010/wordprocessingShape" mc:Ignorable="w14 w15 w16se w16cid wp14">
   <w:p>
     <w:pPr>
       <w:pStyle w:val="Header"/>
@@ -5209,6 +5356,23 @@
       <w:szCs w:val="36"/>
     </w:rPr>
   </w:style>
+  <w:style w:type="character" w:styleId="Hyperlink">
+    <w:name w:val="Hyperlink"/>
+    <w:basedOn w:val="DefaultParagraphFont"/>
+    <w:uiPriority w:val="99"/>
+    <w:semiHidden/>
+    <w:unhideWhenUsed/>
+    <w:rsid w:val="00C92251"/>
+    <w:rPr>
+      <w:color w:val="0000FF"/>
+      <w:u w:val="single"/>
+    </w:rPr>
+  </w:style>
+  <w:style w:type="character" w:customStyle="1" w:styleId="apple-converted-space">
+    <w:name w:val="apple-converted-space"/>
+    <w:basedOn w:val="DefaultParagraphFont"/>
+    <w:rsid w:val="00C92251"/>
+  </w:style>
 </w:styles>
 </file>
 

</xml_diff>